<commit_message>
Fix: Spatial Planning API Key.
</commit_message>
<xml_diff>
--- a/Workflow.docx
+++ b/Workflow.docx
@@ -146,7 +146,7 @@
           <w:i/>
           <w:iCs/>
         </w:rPr>
-        <w:t>.\set-api-key.ps1 -ServiceName "bag" -APIKey "</w:t>
+        <w:t>.\set-api-key.ps1 -ServiceName "dso" -APIKey "</w:t>
       </w:r>
       <w:r>
         <w:rPr>
@@ -175,21 +175,36 @@
           <w:i/>
           <w:iCs/>
         </w:rPr>
-        <w:t>.\set-api-key.ps1 -ServiceName "dso" -APIKey "</w:t>
-      </w:r>
-      <w:r>
-        <w:rPr>
-          <w:i/>
-          <w:iCs/>
-        </w:rPr>
-        <w:t>your-api-key-here</w:t>
-      </w:r>
-      <w:r>
-        <w:rPr>
-          <w:i/>
-          <w:iCs/>
-        </w:rPr>
-        <w:t>"</w:t>
+        <w:t>.\set-api-key.ps1 -ServiceName "</w:t>
+      </w:r>
+      <w:r>
+        <w:rPr>
+          <w:i/>
+          <w:iCs/>
+        </w:rPr>
+        <w:t>planning</w:t>
+      </w:r>
+      <w:r>
+        <w:rPr>
+          <w:i/>
+          <w:iCs/>
+        </w:rPr>
+        <w:t>" -APIKey "your-api-key-here"</w:t>
+      </w:r>
+    </w:p>
+    <w:p>
+      <w:pPr>
+        <w:rPr>
+          <w:i/>
+          <w:iCs/>
+        </w:rPr>
+      </w:pPr>
+      <w:r>
+        <w:rPr>
+          <w:i/>
+          <w:iCs/>
+        </w:rPr>
+        <w:t>.\set-api-key.ps1 -ServiceName "bag" -APIKey "your-api-key-here"</w:t>
       </w:r>
     </w:p>
     <w:p/>
@@ -281,6 +296,7 @@
         <w:pStyle w:val="Heading3"/>
       </w:pPr>
       <w:r>
+        <w:lastRenderedPageBreak/>
         <w:t xml:space="preserve">Convert to </w:t>
       </w:r>
       <w:r>
@@ -326,7 +342,6 @@
           <w:i/>
           <w:iCs/>
         </w:rPr>
-        <w:lastRenderedPageBreak/>
         <w:t>java -jar ifc2rdf-1.4.7-shaded.jar --baseURI</w:t>
       </w:r>
       <w:r>
@@ -10479,6 +10494,7 @@
   <w:style w:type="character" w:default="1" w:styleId="DefaultParagraphFont">
     <w:name w:val="Default Paragraph Font"/>
     <w:uiPriority w:val="1"/>
+    <w:semiHidden/>
     <w:unhideWhenUsed/>
   </w:style>
   <w:style w:type="table" w:default="1" w:styleId="TableNormal">

</xml_diff>

<commit_message>
Support for Rule TextAnnotations and Filtering by Point.
</commit_message>
<xml_diff>
--- a/Workflow.docx
+++ b/Workflow.docx
@@ -119,10 +119,13 @@
         <w:t xml:space="preserve">Set </w:t>
       </w:r>
       <w:r>
-        <w:t>DSO, Spatial Planning and BAG</w:t>
-      </w:r>
-      <w:r>
-        <w:t xml:space="preserve"> </w:t>
+        <w:t>DSO, Spatial Plan</w:t>
+      </w:r>
+      <w:r>
+        <w:t>ning</w:t>
+      </w:r>
+      <w:r>
+        <w:t xml:space="preserve"> and BAG </w:t>
       </w:r>
       <w:r>
         <w:t>API Keys</w:t>

</xml_diff>